<commit_message>
Azure merge updates for recordation, pcliams, and updateappdatasheet
</commit_message>
<xml_diff>
--- a/project/documents/communications/UpdateAppDataSheet.docx
+++ b/project/documents/communications/UpdateAppDataSheet.docx
@@ -1,6 +1,6 @@
 
 <file path=word/document.xml><?xml version="1.0" encoding="utf-8"?>
-<w:document xmlns:wpc="http://schemas.microsoft.com/office/word/2010/wordprocessingCanvas" xmlns:cx="http://schemas.microsoft.com/office/drawing/2014/chartex" xmlns:cx1="http://schemas.microsoft.com/office/drawing/2015/9/8/chartex" xmlns:cx2="http://schemas.microsoft.com/office/drawing/2015/10/21/chartex" xmlns:cx3="http://schemas.microsoft.com/office/drawing/2016/5/9/chartex" xmlns:cx4="http://schemas.microsoft.com/office/drawing/2016/5/10/chartex" xmlns:cx5="http://schemas.microsoft.com/office/drawing/2016/5/11/chartex" xmlns:cx6="http://schemas.microsoft.com/office/drawing/2016/5/12/chartex" xmlns:cx7="http://schemas.microsoft.com/office/drawing/2016/5/13/chartex" xmlns:cx8="http://schemas.microsoft.com/office/drawing/2016/5/14/chartex" xmlns:mc="http://schemas.openxmlformats.org/markup-compatibility/2006" xmlns:aink="http://schemas.microsoft.com/office/drawing/2016/ink" xmlns:am3d="http://schemas.microsoft.com/office/drawing/2017/model3d" xmlns:o="urn:schemas-microsoft-com:office:office" xmlns:oel="http://schemas.microsoft.com/office/2019/extlst" xmlns:r="http://schemas.openxmlformats.org/officeDocument/2006/relationships" xmlns:m="http://schemas.openxmlformats.org/officeDocument/2006/math" xmlns:v="urn:schemas-microsoft-com:vml" xmlns:wp14="http://schemas.microsoft.com/office/word/2010/wordprocessingDrawing" xmlns:wp="http://schemas.openxmlformats.org/drawingml/2006/wordprocessingDrawing" xmlns:w10="urn:schemas-microsoft-com:office:word" xmlns:w="http://schemas.openxmlformats.org/wordprocessingml/2006/main" xmlns:w14="http://schemas.microsoft.com/office/word/2010/wordml" xmlns:w15="http://schemas.microsoft.com/office/word/2012/wordml" xmlns:w16cex="http://schemas.microsoft.com/office/word/2018/wordml/cex" xmlns:w16cid="http://schemas.microsoft.com/office/word/2016/wordml/cid" xmlns:w16="http://schemas.microsoft.com/office/word/2018/wordml" xmlns:w16sdtdh="http://schemas.microsoft.com/office/word/2020/wordml/sdtdatahash" xmlns:w16se="http://schemas.microsoft.com/office/word/2015/wordml/symex" xmlns:wpg="http://schemas.microsoft.com/office/word/2010/wordprocessingGroup" xmlns:wpi="http://schemas.microsoft.com/office/word/2010/wordprocessingInk" xmlns:wne="http://schemas.microsoft.com/office/word/2006/wordml" xmlns:wps="http://schemas.microsoft.com/office/word/2010/wordprocessingShape" mc:Ignorable="w14 w15 w16se w16cid w16 w16cex w16sdtdh wp14">
+<w:document xmlns:wpc="http://schemas.microsoft.com/office/word/2010/wordprocessingCanvas" xmlns:cx="http://schemas.microsoft.com/office/drawing/2014/chartex" xmlns:cx1="http://schemas.microsoft.com/office/drawing/2015/9/8/chartex" xmlns:cx2="http://schemas.microsoft.com/office/drawing/2015/10/21/chartex" xmlns:cx3="http://schemas.microsoft.com/office/drawing/2016/5/9/chartex" xmlns:cx4="http://schemas.microsoft.com/office/drawing/2016/5/10/chartex" xmlns:cx5="http://schemas.microsoft.com/office/drawing/2016/5/11/chartex" xmlns:cx6="http://schemas.microsoft.com/office/drawing/2016/5/12/chartex" xmlns:cx7="http://schemas.microsoft.com/office/drawing/2016/5/13/chartex" xmlns:cx8="http://schemas.microsoft.com/office/drawing/2016/5/14/chartex" xmlns:mc="http://schemas.openxmlformats.org/markup-compatibility/2006" xmlns:aink="http://schemas.microsoft.com/office/drawing/2016/ink" xmlns:am3d="http://schemas.microsoft.com/office/drawing/2017/model3d" xmlns:o="urn:schemas-microsoft-com:office:office" xmlns:oel="http://schemas.microsoft.com/office/2019/extlst" xmlns:r="http://schemas.openxmlformats.org/officeDocument/2006/relationships" xmlns:m="http://schemas.openxmlformats.org/officeDocument/2006/math" xmlns:v="urn:schemas-microsoft-com:vml" xmlns:wp14="http://schemas.microsoft.com/office/word/2010/wordprocessingDrawing" xmlns:wp="http://schemas.openxmlformats.org/drawingml/2006/wordprocessingDrawing" xmlns:w10="urn:schemas-microsoft-com:office:word" xmlns:w="http://schemas.openxmlformats.org/wordprocessingml/2006/main" xmlns:w14="http://schemas.microsoft.com/office/word/2010/wordml" xmlns:w15="http://schemas.microsoft.com/office/word/2012/wordml" xmlns:w16cex="http://schemas.microsoft.com/office/word/2018/wordml/cex" xmlns:w16cid="http://schemas.microsoft.com/office/word/2016/wordml/cid" xmlns:w16="http://schemas.microsoft.com/office/word/2018/wordml" xmlns:w16du="http://schemas.microsoft.com/office/word/2023/wordml/word16du" xmlns:w16sdtdh="http://schemas.microsoft.com/office/word/2020/wordml/sdtdatahash" xmlns:w16sdtfl="http://schemas.microsoft.com/office/word/2024/wordml/sdtformatlock" xmlns:w16se="http://schemas.microsoft.com/office/word/2015/wordml/symex" xmlns:wpg="http://schemas.microsoft.com/office/word/2010/wordprocessingGroup" xmlns:wpi="http://schemas.microsoft.com/office/word/2010/wordprocessingInk" xmlns:wne="http://schemas.microsoft.com/office/word/2006/wordml" xmlns:wps="http://schemas.microsoft.com/office/word/2010/wordprocessingShape" mc:Ignorable="w14 w15 w16se w16cid w16 w16cex w16sdtdh w16sdtfl w16du wp14">
   <w:body>
     <w:p>
       <w:pPr>
@@ -1750,194 +1750,6 @@
     <w:p>
       <w:pPr>
         <w:tabs>
-          <w:tab w:val="left" w:pos="6300"/>
-        </w:tabs>
-        <w:rPr>
-          <w:rFonts w:cs="Times New Roman TUR"/>
-          <w:sz w:val="24"/>
-        </w:rPr>
-      </w:pPr>
-    </w:p>
-    <w:p>
-      <w:pPr>
-        <w:rPr>
-          <w:sz w:val="18"/>
-          <w:szCs w:val="18"/>
-          <w:u w:val="single"/>
-        </w:rPr>
-      </w:pPr>
-      <w:r>
-        <w:rPr>
-          <w:sz w:val="18"/>
-          <w:szCs w:val="18"/>
-          <w:u w:val="single"/>
-        </w:rPr>
-        <w:t>CERTIFICATE UNDER 37 CFR 1.8:</w:t>
-      </w:r>
-      <w:r>
-        <w:rPr>
-          <w:sz w:val="18"/>
-          <w:szCs w:val="18"/>
-        </w:rPr>
-        <w:t xml:space="preserve">  The undersigned hereby certifies that this correspondence is being </w:t>
-      </w:r>
-      <w:r>
-        <w:rPr>
-          <w:noProof/>
-          <w:sz w:val="18"/>
-          <w:szCs w:val="18"/>
-        </w:rPr>
-        <w:t>filed using the USPTO's electronic filing system EFS-Web, and is</w:t>
-      </w:r>
-      <w:r>
-        <w:rPr>
-          <w:sz w:val="18"/>
-          <w:szCs w:val="18"/>
-        </w:rPr>
-        <w:t xml:space="preserve"> </w:t>
-      </w:r>
-      <w:r>
-        <w:rPr>
-          <w:sz w:val="18"/>
-          <w:szCs w:val="18"/>
-        </w:rPr>
-        <w:t xml:space="preserve">addressed to:  </w:t>
-      </w:r>
-      <w:r>
-        <w:rPr>
-          <w:sz w:val="18"/>
-          <w:szCs w:val="18"/>
-        </w:rPr>
-        <w:t xml:space="preserve">Commissioner for Patents, P.O. Box 1450, Alexandria, VA 22313-1450 on this </w:t>
-      </w:r>
-      <w:r>
-        <w:rPr>
-          <w:sz w:val="18"/>
-          <w:szCs w:val="18"/>
-          <w:u w:val="single"/>
-        </w:rPr>
-        <w:t xml:space="preserve">          </w:t>
-      </w:r>
-      <w:r>
-        <w:rPr>
-          <w:sz w:val="18"/>
-          <w:szCs w:val="18"/>
-        </w:rPr>
-        <w:t xml:space="preserve"> day of</w:t>
-      </w:r>
-      <w:r>
-        <w:rPr>
-          <w:sz w:val="18"/>
-          <w:szCs w:val="18"/>
-        </w:rPr>
-        <w:t xml:space="preserve"> </w:t>
-      </w:r>
-      <w:r>
-        <w:rPr>
-          <w:sz w:val="18"/>
-          <w:szCs w:val="18"/>
-        </w:rPr>
-        <w:t>&lt;&lt;currentMo&gt;&gt;, &lt;&lt;currentYr&gt;&gt;.</w:t>
-      </w:r>
-    </w:p>
-    <w:p>
-      <w:pPr>
-        <w:rPr>
-          <w:sz w:val="18"/>
-          <w:szCs w:val="18"/>
-        </w:rPr>
-      </w:pPr>
-    </w:p>
-    <w:p>
-      <w:pPr>
-        <w:tabs>
-          <w:tab w:val="left" w:pos="4320"/>
-        </w:tabs>
-        <w:jc w:val="both"/>
-        <w:rPr>
-          <w:noProof/>
-          <w:sz w:val="18"/>
-          <w:szCs w:val="18"/>
-        </w:rPr>
-      </w:pPr>
-      <w:r>
-        <w:rPr>
-          <w:noProof/>
-          <w:sz w:val="18"/>
-          <w:szCs w:val="18"/>
-        </w:rPr>
-        <w:t>_______________</w:t>
-      </w:r>
-      <w:r>
-        <w:rPr>
-          <w:noProof/>
-          <w:sz w:val="18"/>
-          <w:szCs w:val="18"/>
-        </w:rPr>
-        <w:t>___________________________</w:t>
-      </w:r>
-      <w:r>
-        <w:rPr>
-          <w:noProof/>
-          <w:sz w:val="18"/>
-          <w:szCs w:val="18"/>
-        </w:rPr>
-        <w:t>________</w:t>
-      </w:r>
-      <w:r>
-        <w:rPr>
-          <w:noProof/>
-          <w:sz w:val="18"/>
-          <w:szCs w:val="18"/>
-        </w:rPr>
-        <w:tab/>
-        <w:t>__________________________________________________________</w:t>
-      </w:r>
-    </w:p>
-    <w:p>
-      <w:pPr>
-        <w:tabs>
-          <w:tab w:val="left" w:pos="5040"/>
-        </w:tabs>
-        <w:rPr>
-          <w:noProof/>
-          <w:sz w:val="18"/>
-          <w:szCs w:val="18"/>
-        </w:rPr>
-      </w:pPr>
-      <w:r>
-        <w:rPr>
-          <w:noProof/>
-          <w:sz w:val="18"/>
-          <w:szCs w:val="18"/>
-        </w:rPr>
-        <w:t>Name</w:t>
-      </w:r>
-      <w:r>
-        <w:rPr>
-          <w:noProof/>
-          <w:sz w:val="18"/>
-          <w:szCs w:val="18"/>
-        </w:rPr>
-        <w:tab/>
-        <w:t>Signature</w:t>
-      </w:r>
-    </w:p>
-    <w:p>
-      <w:pPr>
-        <w:tabs>
-          <w:tab w:val="left" w:pos="5040"/>
-        </w:tabs>
-        <w:rPr>
-          <w:noProof/>
-          <w:sz w:val="18"/>
-          <w:szCs w:val="18"/>
-        </w:rPr>
-      </w:pPr>
-    </w:p>
-    <w:p>
-      <w:pPr>
-        <w:tabs>
           <w:tab w:val="left" w:pos="5040"/>
         </w:tabs>
         <w:rPr>
@@ -1976,7 +1788,7 @@
 </file>
 
 <file path=word/endnotes.xml><?xml version="1.0" encoding="utf-8"?>
-<w:endnotes xmlns:wpc="http://schemas.microsoft.com/office/word/2010/wordprocessingCanvas" xmlns:cx="http://schemas.microsoft.com/office/drawing/2014/chartex" xmlns:cx1="http://schemas.microsoft.com/office/drawing/2015/9/8/chartex" xmlns:cx2="http://schemas.microsoft.com/office/drawing/2015/10/21/chartex" xmlns:cx3="http://schemas.microsoft.com/office/drawing/2016/5/9/chartex" xmlns:cx4="http://schemas.microsoft.com/office/drawing/2016/5/10/chartex" xmlns:cx5="http://schemas.microsoft.com/office/drawing/2016/5/11/chartex" xmlns:cx6="http://schemas.microsoft.com/office/drawing/2016/5/12/chartex" xmlns:cx7="http://schemas.microsoft.com/office/drawing/2016/5/13/chartex" xmlns:cx8="http://schemas.microsoft.com/office/drawing/2016/5/14/chartex" xmlns:mc="http://schemas.openxmlformats.org/markup-compatibility/2006" xmlns:aink="http://schemas.microsoft.com/office/drawing/2016/ink" xmlns:am3d="http://schemas.microsoft.com/office/drawing/2017/model3d" xmlns:o="urn:schemas-microsoft-com:office:office" xmlns:oel="http://schemas.microsoft.com/office/2019/extlst" xmlns:r="http://schemas.openxmlformats.org/officeDocument/2006/relationships" xmlns:m="http://schemas.openxmlformats.org/officeDocument/2006/math" xmlns:v="urn:schemas-microsoft-com:vml" xmlns:wp14="http://schemas.microsoft.com/office/word/2010/wordprocessingDrawing" xmlns:wp="http://schemas.openxmlformats.org/drawingml/2006/wordprocessingDrawing" xmlns:w10="urn:schemas-microsoft-com:office:word" xmlns:w="http://schemas.openxmlformats.org/wordprocessingml/2006/main" xmlns:w14="http://schemas.microsoft.com/office/word/2010/wordml" xmlns:w15="http://schemas.microsoft.com/office/word/2012/wordml" xmlns:w16cex="http://schemas.microsoft.com/office/word/2018/wordml/cex" xmlns:w16cid="http://schemas.microsoft.com/office/word/2016/wordml/cid" xmlns:w16="http://schemas.microsoft.com/office/word/2018/wordml" xmlns:w16sdtdh="http://schemas.microsoft.com/office/word/2020/wordml/sdtdatahash" xmlns:w16se="http://schemas.microsoft.com/office/word/2015/wordml/symex" xmlns:wpg="http://schemas.microsoft.com/office/word/2010/wordprocessingGroup" xmlns:wpi="http://schemas.microsoft.com/office/word/2010/wordprocessingInk" xmlns:wne="http://schemas.microsoft.com/office/word/2006/wordml" xmlns:wps="http://schemas.microsoft.com/office/word/2010/wordprocessingShape" mc:Ignorable="w14 w15 w16se w16cid w16 w16cex w16sdtdh wp14">
+<w:endnotes xmlns:wpc="http://schemas.microsoft.com/office/word/2010/wordprocessingCanvas" xmlns:cx="http://schemas.microsoft.com/office/drawing/2014/chartex" xmlns:cx1="http://schemas.microsoft.com/office/drawing/2015/9/8/chartex" xmlns:cx2="http://schemas.microsoft.com/office/drawing/2015/10/21/chartex" xmlns:cx3="http://schemas.microsoft.com/office/drawing/2016/5/9/chartex" xmlns:cx4="http://schemas.microsoft.com/office/drawing/2016/5/10/chartex" xmlns:cx5="http://schemas.microsoft.com/office/drawing/2016/5/11/chartex" xmlns:cx6="http://schemas.microsoft.com/office/drawing/2016/5/12/chartex" xmlns:cx7="http://schemas.microsoft.com/office/drawing/2016/5/13/chartex" xmlns:cx8="http://schemas.microsoft.com/office/drawing/2016/5/14/chartex" xmlns:mc="http://schemas.openxmlformats.org/markup-compatibility/2006" xmlns:aink="http://schemas.microsoft.com/office/drawing/2016/ink" xmlns:am3d="http://schemas.microsoft.com/office/drawing/2017/model3d" xmlns:o="urn:schemas-microsoft-com:office:office" xmlns:oel="http://schemas.microsoft.com/office/2019/extlst" xmlns:r="http://schemas.openxmlformats.org/officeDocument/2006/relationships" xmlns:m="http://schemas.openxmlformats.org/officeDocument/2006/math" xmlns:v="urn:schemas-microsoft-com:vml" xmlns:wp14="http://schemas.microsoft.com/office/word/2010/wordprocessingDrawing" xmlns:wp="http://schemas.openxmlformats.org/drawingml/2006/wordprocessingDrawing" xmlns:w10="urn:schemas-microsoft-com:office:word" xmlns:w="http://schemas.openxmlformats.org/wordprocessingml/2006/main" xmlns:w14="http://schemas.microsoft.com/office/word/2010/wordml" xmlns:w15="http://schemas.microsoft.com/office/word/2012/wordml" xmlns:w16cex="http://schemas.microsoft.com/office/word/2018/wordml/cex" xmlns:w16cid="http://schemas.microsoft.com/office/word/2016/wordml/cid" xmlns:w16="http://schemas.microsoft.com/office/word/2018/wordml" xmlns:w16du="http://schemas.microsoft.com/office/word/2023/wordml/word16du" xmlns:w16sdtdh="http://schemas.microsoft.com/office/word/2020/wordml/sdtdatahash" xmlns:w16sdtfl="http://schemas.microsoft.com/office/word/2024/wordml/sdtformatlock" xmlns:w16se="http://schemas.microsoft.com/office/word/2015/wordml/symex" xmlns:wpg="http://schemas.microsoft.com/office/word/2010/wordprocessingGroup" xmlns:wpi="http://schemas.microsoft.com/office/word/2010/wordprocessingInk" xmlns:wne="http://schemas.microsoft.com/office/word/2006/wordml" xmlns:wps="http://schemas.microsoft.com/office/word/2010/wordprocessingShape" mc:Ignorable="w14 w15 w16se w16cid w16 w16cex w16sdtdh w16sdtfl w16du wp14">
   <w:endnote w:type="separator" w:id="-1">
     <w:p>
       <w:r>
@@ -1995,7 +1807,7 @@
 </file>
 
 <file path=word/footnotes.xml><?xml version="1.0" encoding="utf-8"?>
-<w:footnotes xmlns:wpc="http://schemas.microsoft.com/office/word/2010/wordprocessingCanvas" xmlns:cx="http://schemas.microsoft.com/office/drawing/2014/chartex" xmlns:cx1="http://schemas.microsoft.com/office/drawing/2015/9/8/chartex" xmlns:cx2="http://schemas.microsoft.com/office/drawing/2015/10/21/chartex" xmlns:cx3="http://schemas.microsoft.com/office/drawing/2016/5/9/chartex" xmlns:cx4="http://schemas.microsoft.com/office/drawing/2016/5/10/chartex" xmlns:cx5="http://schemas.microsoft.com/office/drawing/2016/5/11/chartex" xmlns:cx6="http://schemas.microsoft.com/office/drawing/2016/5/12/chartex" xmlns:cx7="http://schemas.microsoft.com/office/drawing/2016/5/13/chartex" xmlns:cx8="http://schemas.microsoft.com/office/drawing/2016/5/14/chartex" xmlns:mc="http://schemas.openxmlformats.org/markup-compatibility/2006" xmlns:aink="http://schemas.microsoft.com/office/drawing/2016/ink" xmlns:am3d="http://schemas.microsoft.com/office/drawing/2017/model3d" xmlns:o="urn:schemas-microsoft-com:office:office" xmlns:oel="http://schemas.microsoft.com/office/2019/extlst" xmlns:r="http://schemas.openxmlformats.org/officeDocument/2006/relationships" xmlns:m="http://schemas.openxmlformats.org/officeDocument/2006/math" xmlns:v="urn:schemas-microsoft-com:vml" xmlns:wp14="http://schemas.microsoft.com/office/word/2010/wordprocessingDrawing" xmlns:wp="http://schemas.openxmlformats.org/drawingml/2006/wordprocessingDrawing" xmlns:w10="urn:schemas-microsoft-com:office:word" xmlns:w="http://schemas.openxmlformats.org/wordprocessingml/2006/main" xmlns:w14="http://schemas.microsoft.com/office/word/2010/wordml" xmlns:w15="http://schemas.microsoft.com/office/word/2012/wordml" xmlns:w16cex="http://schemas.microsoft.com/office/word/2018/wordml/cex" xmlns:w16cid="http://schemas.microsoft.com/office/word/2016/wordml/cid" xmlns:w16="http://schemas.microsoft.com/office/word/2018/wordml" xmlns:w16sdtdh="http://schemas.microsoft.com/office/word/2020/wordml/sdtdatahash" xmlns:w16se="http://schemas.microsoft.com/office/word/2015/wordml/symex" xmlns:wpg="http://schemas.microsoft.com/office/word/2010/wordprocessingGroup" xmlns:wpi="http://schemas.microsoft.com/office/word/2010/wordprocessingInk" xmlns:wne="http://schemas.microsoft.com/office/word/2006/wordml" xmlns:wps="http://schemas.microsoft.com/office/word/2010/wordprocessingShape" mc:Ignorable="w14 w15 w16se w16cid w16 w16cex w16sdtdh wp14">
+<w:footnotes xmlns:wpc="http://schemas.microsoft.com/office/word/2010/wordprocessingCanvas" xmlns:cx="http://schemas.microsoft.com/office/drawing/2014/chartex" xmlns:cx1="http://schemas.microsoft.com/office/drawing/2015/9/8/chartex" xmlns:cx2="http://schemas.microsoft.com/office/drawing/2015/10/21/chartex" xmlns:cx3="http://schemas.microsoft.com/office/drawing/2016/5/9/chartex" xmlns:cx4="http://schemas.microsoft.com/office/drawing/2016/5/10/chartex" xmlns:cx5="http://schemas.microsoft.com/office/drawing/2016/5/11/chartex" xmlns:cx6="http://schemas.microsoft.com/office/drawing/2016/5/12/chartex" xmlns:cx7="http://schemas.microsoft.com/office/drawing/2016/5/13/chartex" xmlns:cx8="http://schemas.microsoft.com/office/drawing/2016/5/14/chartex" xmlns:mc="http://schemas.openxmlformats.org/markup-compatibility/2006" xmlns:aink="http://schemas.microsoft.com/office/drawing/2016/ink" xmlns:am3d="http://schemas.microsoft.com/office/drawing/2017/model3d" xmlns:o="urn:schemas-microsoft-com:office:office" xmlns:oel="http://schemas.microsoft.com/office/2019/extlst" xmlns:r="http://schemas.openxmlformats.org/officeDocument/2006/relationships" xmlns:m="http://schemas.openxmlformats.org/officeDocument/2006/math" xmlns:v="urn:schemas-microsoft-com:vml" xmlns:wp14="http://schemas.microsoft.com/office/word/2010/wordprocessingDrawing" xmlns:wp="http://schemas.openxmlformats.org/drawingml/2006/wordprocessingDrawing" xmlns:w10="urn:schemas-microsoft-com:office:word" xmlns:w="http://schemas.openxmlformats.org/wordprocessingml/2006/main" xmlns:w14="http://schemas.microsoft.com/office/word/2010/wordml" xmlns:w15="http://schemas.microsoft.com/office/word/2012/wordml" xmlns:w16cex="http://schemas.microsoft.com/office/word/2018/wordml/cex" xmlns:w16cid="http://schemas.microsoft.com/office/word/2016/wordml/cid" xmlns:w16="http://schemas.microsoft.com/office/word/2018/wordml" xmlns:w16du="http://schemas.microsoft.com/office/word/2023/wordml/word16du" xmlns:w16sdtdh="http://schemas.microsoft.com/office/word/2020/wordml/sdtdatahash" xmlns:w16sdtfl="http://schemas.microsoft.com/office/word/2024/wordml/sdtformatlock" xmlns:w16se="http://schemas.microsoft.com/office/word/2015/wordml/symex" xmlns:wpg="http://schemas.microsoft.com/office/word/2010/wordprocessingGroup" xmlns:wpi="http://schemas.microsoft.com/office/word/2010/wordprocessingInk" xmlns:wne="http://schemas.microsoft.com/office/word/2006/wordml" xmlns:wps="http://schemas.microsoft.com/office/word/2010/wordprocessingShape" mc:Ignorable="w14 w15 w16se w16cid w16 w16cex w16sdtdh w16sdtfl w16du wp14">
   <w:footnote w:type="separator" w:id="-1">
     <w:p>
       <w:r>
@@ -2014,7 +1826,7 @@
 </file>
 
 <file path=word/styles.xml><?xml version="1.0" encoding="utf-8"?>
-<w:styles xmlns:mc="http://schemas.openxmlformats.org/markup-compatibility/2006" xmlns:r="http://schemas.openxmlformats.org/officeDocument/2006/relationships" xmlns:w="http://schemas.openxmlformats.org/wordprocessingml/2006/main" xmlns:w14="http://schemas.microsoft.com/office/word/2010/wordml" xmlns:w15="http://schemas.microsoft.com/office/word/2012/wordml" xmlns:w16cex="http://schemas.microsoft.com/office/word/2018/wordml/cex" xmlns:w16cid="http://schemas.microsoft.com/office/word/2016/wordml/cid" xmlns:w16="http://schemas.microsoft.com/office/word/2018/wordml" xmlns:w16sdtdh="http://schemas.microsoft.com/office/word/2020/wordml/sdtdatahash" xmlns:w16se="http://schemas.microsoft.com/office/word/2015/wordml/symex" mc:Ignorable="w14 w15 w16se w16cid w16 w16cex w16sdtdh">
+<w:styles xmlns:mc="http://schemas.openxmlformats.org/markup-compatibility/2006" xmlns:r="http://schemas.openxmlformats.org/officeDocument/2006/relationships" xmlns:w="http://schemas.openxmlformats.org/wordprocessingml/2006/main" xmlns:w14="http://schemas.microsoft.com/office/word/2010/wordml" xmlns:w15="http://schemas.microsoft.com/office/word/2012/wordml" xmlns:w16cex="http://schemas.microsoft.com/office/word/2018/wordml/cex" xmlns:w16cid="http://schemas.microsoft.com/office/word/2016/wordml/cid" xmlns:w16="http://schemas.microsoft.com/office/word/2018/wordml" xmlns:w16du="http://schemas.microsoft.com/office/word/2023/wordml/word16du" xmlns:w16sdtdh="http://schemas.microsoft.com/office/word/2020/wordml/sdtdatahash" xmlns:w16sdtfl="http://schemas.microsoft.com/office/word/2024/wordml/sdtformatlock" xmlns:w16se="http://schemas.microsoft.com/office/word/2015/wordml/symex" mc:Ignorable="w14 w15 w16se w16cid w16 w16cex w16sdtdh w16sdtfl w16du">
   <w:docDefaults>
     <w:rPrDefault>
       <w:rPr>
@@ -2040,6 +1852,50 @@
     <w:lsdException w:name="Subtitle" w:qFormat="1"/>
     <w:lsdException w:name="Strong" w:qFormat="1"/>
     <w:lsdException w:name="Emphasis" w:qFormat="1"/>
+    <w:lsdException w:name="Normal Table" w:semiHidden="1" w:unhideWhenUsed="1"/>
+    <w:lsdException w:name="Table Simple 1" w:semiHidden="1" w:unhideWhenUsed="1"/>
+    <w:lsdException w:name="Table Simple 2" w:semiHidden="1" w:unhideWhenUsed="1"/>
+    <w:lsdException w:name="Table Simple 3" w:semiHidden="1" w:unhideWhenUsed="1"/>
+    <w:lsdException w:name="Table Classic 1" w:semiHidden="1" w:unhideWhenUsed="1"/>
+    <w:lsdException w:name="Table Classic 2" w:semiHidden="1" w:unhideWhenUsed="1"/>
+    <w:lsdException w:name="Table Classic 3" w:semiHidden="1" w:unhideWhenUsed="1"/>
+    <w:lsdException w:name="Table Classic 4" w:semiHidden="1" w:unhideWhenUsed="1"/>
+    <w:lsdException w:name="Table Colorful 1" w:semiHidden="1" w:unhideWhenUsed="1"/>
+    <w:lsdException w:name="Table Colorful 2" w:semiHidden="1" w:unhideWhenUsed="1"/>
+    <w:lsdException w:name="Table Colorful 3" w:semiHidden="1" w:unhideWhenUsed="1"/>
+    <w:lsdException w:name="Table Columns 1" w:semiHidden="1" w:unhideWhenUsed="1"/>
+    <w:lsdException w:name="Table Columns 2" w:semiHidden="1" w:unhideWhenUsed="1"/>
+    <w:lsdException w:name="Table Columns 3" w:semiHidden="1" w:unhideWhenUsed="1"/>
+    <w:lsdException w:name="Table Columns 4" w:semiHidden="1" w:unhideWhenUsed="1"/>
+    <w:lsdException w:name="Table Columns 5" w:semiHidden="1" w:unhideWhenUsed="1"/>
+    <w:lsdException w:name="Table Grid 1" w:semiHidden="1" w:unhideWhenUsed="1"/>
+    <w:lsdException w:name="Table Grid 2" w:semiHidden="1" w:unhideWhenUsed="1"/>
+    <w:lsdException w:name="Table Grid 3" w:semiHidden="1" w:unhideWhenUsed="1"/>
+    <w:lsdException w:name="Table Grid 4" w:semiHidden="1" w:unhideWhenUsed="1"/>
+    <w:lsdException w:name="Table Grid 5" w:semiHidden="1" w:unhideWhenUsed="1"/>
+    <w:lsdException w:name="Table Grid 6" w:semiHidden="1" w:unhideWhenUsed="1"/>
+    <w:lsdException w:name="Table Grid 7" w:semiHidden="1" w:unhideWhenUsed="1"/>
+    <w:lsdException w:name="Table Grid 8" w:semiHidden="1" w:unhideWhenUsed="1"/>
+    <w:lsdException w:name="Table List 1" w:semiHidden="1" w:unhideWhenUsed="1"/>
+    <w:lsdException w:name="Table List 2" w:semiHidden="1" w:unhideWhenUsed="1"/>
+    <w:lsdException w:name="Table List 3" w:semiHidden="1" w:unhideWhenUsed="1"/>
+    <w:lsdException w:name="Table List 4" w:semiHidden="1" w:unhideWhenUsed="1"/>
+    <w:lsdException w:name="Table List 5" w:semiHidden="1" w:unhideWhenUsed="1"/>
+    <w:lsdException w:name="Table List 6" w:semiHidden="1" w:unhideWhenUsed="1"/>
+    <w:lsdException w:name="Table List 7" w:semiHidden="1" w:unhideWhenUsed="1"/>
+    <w:lsdException w:name="Table List 8" w:semiHidden="1" w:unhideWhenUsed="1"/>
+    <w:lsdException w:name="Table 3D effects 1" w:semiHidden="1" w:unhideWhenUsed="1"/>
+    <w:lsdException w:name="Table 3D effects 2" w:semiHidden="1" w:unhideWhenUsed="1"/>
+    <w:lsdException w:name="Table 3D effects 3" w:semiHidden="1" w:unhideWhenUsed="1"/>
+    <w:lsdException w:name="Table Contemporary" w:semiHidden="1" w:unhideWhenUsed="1"/>
+    <w:lsdException w:name="Table Elegant" w:semiHidden="1" w:unhideWhenUsed="1"/>
+    <w:lsdException w:name="Table Professional" w:semiHidden="1" w:unhideWhenUsed="1"/>
+    <w:lsdException w:name="Table Subtle 1" w:semiHidden="1" w:unhideWhenUsed="1"/>
+    <w:lsdException w:name="Table Subtle 2" w:semiHidden="1" w:unhideWhenUsed="1"/>
+    <w:lsdException w:name="Table Web 1" w:semiHidden="1" w:unhideWhenUsed="1"/>
+    <w:lsdException w:name="Table Web 2" w:semiHidden="1" w:unhideWhenUsed="1"/>
+    <w:lsdException w:name="Table Web 3" w:semiHidden="1" w:unhideWhenUsed="1"/>
+    <w:lsdException w:name="Table Theme" w:semiHidden="1" w:unhideWhenUsed="1"/>
     <w:lsdException w:name="Placeholder Text" w:semiHidden="1" w:uiPriority="99"/>
     <w:lsdException w:name="No Spacing" w:uiPriority="1" w:qFormat="1"/>
     <w:lsdException w:name="Light Shading" w:uiPriority="60"/>
@@ -2350,6 +2206,7 @@
   <w:style w:type="character" w:default="1" w:styleId="DefaultParagraphFont">
     <w:name w:val="Default Paragraph Font"/>
     <w:uiPriority w:val="1"/>
+    <w:semiHidden/>
     <w:unhideWhenUsed/>
   </w:style>
   <w:style w:type="table" w:default="1" w:styleId="TableNormal">

</xml_diff>